<commit_message>
feat: standardisasi variabel teguran 1-3 dan update backend context
</commit_message>
<xml_diff>
--- a/rusun-backend/app/templates/template_teguran1.docx
+++ b/rusun-backend/app/templates/template_teguran1.docx
@@ -42,7 +42,7 @@
           <v:shape id="_x0000_s1108" type="#_x0000_t75" style="position:absolute;margin-left:-25.55pt;margin-top:2.65pt;width:72.3pt;height:79.6pt;z-index:251658240;visibility:visible;mso-wrap-style:tight;mso-wrap-edited:f">
             <v:imagedata r:id="rId6" o:title=""/>
           </v:shape>
-          <o:OLEObject Type="Embed" ProgID="Word.Picture.8" ShapeID="_x0000_s1108" DrawAspect="Content" ObjectID="_1837077511" r:id="rId7"/>
+          <o:OLEObject Type="Embed" ProgID="Word.Picture.8" ShapeID="_x0000_s1108" DrawAspect="Content" ObjectID="_1837241156" r:id="rId7"/>
         </w:object>
       </w:r>
       <w:r>
@@ -126,8 +126,8 @@
                               </w:rPr>
                               <w:t xml:space="preserve">DAERAH </w:t>
                             </w:r>
-                            <w:smartTag w:uri="urn:schemas-microsoft-com:office:smarttags" w:element="City">
-                              <w:smartTag w:uri="urn:schemas-microsoft-com:office:smarttags" w:element="place">
+                            <w:smartTag w:uri="urn:schemas-microsoft-com:office:smarttags" w:element="place">
+                              <w:smartTag w:uri="urn:schemas-microsoft-com:office:smarttags" w:element="City">
                                 <w:r>
                                   <w:rPr>
                                     <w:rFonts w:ascii="Arial Narrow" w:hAnsi="Arial Narrow"/>
@@ -229,18 +229,7 @@
                                 <w:szCs w:val="18"/>
                                 <w:lang w:val="id-ID"/>
                               </w:rPr>
-                              <w:t xml:space="preserve"> At – taqwa Kelurahan Cigugur Tengah Kecamatan Cimahi Tengah </w:t>
-                            </w:r>
-                            <w:proofErr w:type="gramStart"/>
-                            <w:r>
-                              <w:rPr>
-                                <w:b w:val="0"/>
-                                <w:bCs w:val="0"/>
-                                <w:sz w:val="18"/>
-                                <w:szCs w:val="18"/>
-                                <w:lang w:val="id-ID"/>
-                              </w:rPr>
-                              <w:t xml:space="preserve">40522 </w:t>
+                              <w:t xml:space="preserve"> At – taqwa Kelurahan Cigugur Tengah Kecamatan Cimahi Tengah 40522 </w:t>
                             </w:r>
                             <w:r>
                               <w:rPr>
@@ -260,18 +249,7 @@
                                 <w:szCs w:val="18"/>
                                 <w:lang w:val="id-ID"/>
                               </w:rPr>
-                              <w:t>Telp</w:t>
-                            </w:r>
-                            <w:proofErr w:type="gramEnd"/>
-                            <w:r>
-                              <w:rPr>
-                                <w:b w:val="0"/>
-                                <w:bCs w:val="0"/>
-                                <w:sz w:val="18"/>
-                                <w:szCs w:val="18"/>
-                                <w:lang w:val="id-ID"/>
-                              </w:rPr>
-                              <w:t>. (022) 6653680</w:t>
+                              <w:t>Telp. (022) 6653680</w:t>
                             </w:r>
                             <w:r>
                               <w:rPr>
@@ -337,8 +315,8 @@
                         </w:rPr>
                         <w:t xml:space="preserve">DAERAH </w:t>
                       </w:r>
-                      <w:smartTag w:uri="urn:schemas-microsoft-com:office:smarttags" w:element="City">
-                        <w:smartTag w:uri="urn:schemas-microsoft-com:office:smarttags" w:element="place">
+                      <w:smartTag w:uri="urn:schemas-microsoft-com:office:smarttags" w:element="place">
+                        <w:smartTag w:uri="urn:schemas-microsoft-com:office:smarttags" w:element="City">
                           <w:r>
                             <w:rPr>
                               <w:rFonts w:ascii="Arial Narrow" w:hAnsi="Arial Narrow"/>
@@ -440,18 +418,7 @@
                           <w:szCs w:val="18"/>
                           <w:lang w:val="id-ID"/>
                         </w:rPr>
-                        <w:t xml:space="preserve"> At – taqwa Kelurahan Cigugur Tengah Kecamatan Cimahi Tengah </w:t>
-                      </w:r>
-                      <w:proofErr w:type="gramStart"/>
-                      <w:r>
-                        <w:rPr>
-                          <w:b w:val="0"/>
-                          <w:bCs w:val="0"/>
-                          <w:sz w:val="18"/>
-                          <w:szCs w:val="18"/>
-                          <w:lang w:val="id-ID"/>
-                        </w:rPr>
-                        <w:t xml:space="preserve">40522 </w:t>
+                        <w:t xml:space="preserve"> At – taqwa Kelurahan Cigugur Tengah Kecamatan Cimahi Tengah 40522 </w:t>
                       </w:r>
                       <w:r>
                         <w:rPr>
@@ -471,18 +438,7 @@
                           <w:szCs w:val="18"/>
                           <w:lang w:val="id-ID"/>
                         </w:rPr>
-                        <w:t>Telp</w:t>
-                      </w:r>
-                      <w:proofErr w:type="gramEnd"/>
-                      <w:r>
-                        <w:rPr>
-                          <w:b w:val="0"/>
-                          <w:bCs w:val="0"/>
-                          <w:sz w:val="18"/>
-                          <w:szCs w:val="18"/>
-                          <w:lang w:val="id-ID"/>
-                        </w:rPr>
-                        <w:t>. (022) 6653680</w:t>
+                        <w:t>Telp. (022) 6653680</w:t>
                       </w:r>
                       <w:r>
                         <w:rPr>
@@ -847,23 +803,7 @@
           <w:color w:val="0000FF"/>
           <w:lang w:val="en-US"/>
         </w:rPr>
-        <w:t>27</w:t>
-      </w:r>
-      <w:r>
-        <w:rPr>
-          <w:rFonts w:ascii="Arial" w:hAnsi="Arial" w:cs="Arial"/>
-          <w:color w:val="0000FF"/>
-          <w:lang w:val="en-US"/>
-        </w:rPr>
-        <w:t xml:space="preserve"> Januari 202</w:t>
-      </w:r>
-      <w:r>
-        <w:rPr>
-          <w:rFonts w:ascii="Arial" w:hAnsi="Arial" w:cs="Arial"/>
-          <w:color w:val="0000FF"/>
-          <w:lang w:val="en-US"/>
-        </w:rPr>
-        <w:t>6</w:t>
+        <w:t>{{ tanggal_surat }}</w:t>
       </w:r>
     </w:p>
     <w:p>
@@ -1041,48 +981,7 @@
                                 <w:color w:val="000000"/>
                                 <w:lang w:val="id-ID"/>
                               </w:rPr>
-                              <w:fldChar w:fldCharType="begin"/>
-                            </w:r>
-                            <w:r>
-                              <w:rPr>
-                                <w:rFonts w:ascii="Arial" w:hAnsi="Arial" w:cs="Arial"/>
-                                <w:b/>
-                                <w:bCs/>
-                                <w:color w:val="000000"/>
-                                <w:lang w:val="id-ID"/>
-                              </w:rPr>
-                              <w:instrText xml:space="preserve"> MERGEFIELD NAMA__PENGHUNI </w:instrText>
-                            </w:r>
-                            <w:r>
-                              <w:rPr>
-                                <w:rFonts w:ascii="Arial" w:hAnsi="Arial" w:cs="Arial"/>
-                                <w:b/>
-                                <w:bCs/>
-                                <w:color w:val="000000"/>
-                                <w:lang w:val="id-ID"/>
-                              </w:rPr>
-                              <w:fldChar w:fldCharType="separate"/>
-                            </w:r>
-                            <w:r>
-                              <w:rPr>
-                                <w:rFonts w:ascii="Arial" w:hAnsi="Arial" w:cs="Arial"/>
-                                <w:b/>
-                                <w:bCs/>
-                                <w:noProof/>
-                                <w:color w:val="000000"/>
-                                <w:lang w:val="id-ID"/>
-                              </w:rPr>
-                              <w:t>Dian pertiwi (lala)</w:t>
-                            </w:r>
-                            <w:r>
-                              <w:rPr>
-                                <w:rFonts w:ascii="Arial" w:hAnsi="Arial" w:cs="Arial"/>
-                                <w:b/>
-                                <w:bCs/>
-                                <w:color w:val="000000"/>
-                                <w:lang w:val="id-ID"/>
-                              </w:rPr>
-                              <w:fldChar w:fldCharType="end"/>
+                              <w:t>{{ nama_penyewa }}</w:t>
                             </w:r>
                           </w:p>
                           <w:p>
@@ -1155,170 +1054,7 @@
                                 <w:color w:val="000000"/>
                                 <w:lang w:val="id-ID"/>
                               </w:rPr>
-                              <w:fldChar w:fldCharType="begin"/>
-                            </w:r>
-                            <w:r>
-                              <w:rPr>
-                                <w:rFonts w:ascii="Arial" w:hAnsi="Arial" w:cs="Arial"/>
-                                <w:b/>
-                                <w:bCs/>
-                                <w:color w:val="000000"/>
-                                <w:lang w:val="id-ID"/>
-                              </w:rPr>
-                              <w:instrText xml:space="preserve"> MERGEFIELD NOMOR__HUNIAN </w:instrText>
-                            </w:r>
-                            <w:r>
-                              <w:rPr>
-                                <w:rFonts w:ascii="Arial" w:hAnsi="Arial" w:cs="Arial"/>
-                                <w:b/>
-                                <w:bCs/>
-                                <w:color w:val="000000"/>
-                                <w:lang w:val="id-ID"/>
-                              </w:rPr>
-                              <w:fldChar w:fldCharType="separate"/>
-                            </w:r>
-                            <w:r>
-                              <w:rPr>
-                                <w:rFonts w:ascii="Arial" w:hAnsi="Arial" w:cs="Arial"/>
-                                <w:b/>
-                                <w:bCs/>
-                                <w:noProof/>
-                                <w:color w:val="000000"/>
-                                <w:lang w:val="id-ID"/>
-                              </w:rPr>
-                              <w:t>D</w:t>
-                            </w:r>
-                            <w:r>
-                              <w:rPr>
-                                <w:rFonts w:ascii="Arial" w:hAnsi="Arial" w:cs="Arial"/>
-                                <w:b/>
-                                <w:bCs/>
-                                <w:color w:val="000000"/>
-                                <w:lang w:val="id-ID"/>
-                              </w:rPr>
-                              <w:fldChar w:fldCharType="end"/>
-                            </w:r>
-                            <w:r>
-                              <w:rPr>
-                                <w:rFonts w:ascii="Arial" w:hAnsi="Arial" w:cs="Arial"/>
-                                <w:b/>
-                                <w:bCs/>
-                                <w:color w:val="000000"/>
-                                <w:lang w:val="en-US"/>
-                              </w:rPr>
-                              <w:t xml:space="preserve"> </w:t>
-                            </w:r>
-                            <w:r>
-                              <w:rPr>
-                                <w:rFonts w:ascii="Arial" w:hAnsi="Arial" w:cs="Arial"/>
-                                <w:b/>
-                                <w:bCs/>
-                                <w:color w:val="000000"/>
-                                <w:lang w:val="en-US"/>
-                              </w:rPr>
-                              <w:fldChar w:fldCharType="begin"/>
-                            </w:r>
-                            <w:r>
-                              <w:rPr>
-                                <w:rFonts w:ascii="Arial" w:hAnsi="Arial" w:cs="Arial"/>
-                                <w:b/>
-                                <w:bCs/>
-                                <w:color w:val="000000"/>
-                                <w:lang w:val="en-US"/>
-                              </w:rPr>
-                              <w:instrText xml:space="preserve"> MERGEFIELD F3 </w:instrText>
-                            </w:r>
-                            <w:r>
-                              <w:rPr>
-                                <w:rFonts w:ascii="Arial" w:hAnsi="Arial" w:cs="Arial"/>
-                                <w:b/>
-                                <w:bCs/>
-                                <w:color w:val="000000"/>
-                                <w:lang w:val="en-US"/>
-                              </w:rPr>
-                              <w:fldChar w:fldCharType="separate"/>
-                            </w:r>
-                            <w:r>
-                              <w:rPr>
-                                <w:rFonts w:ascii="Arial" w:hAnsi="Arial" w:cs="Arial"/>
-                                <w:b/>
-                                <w:bCs/>
-                                <w:noProof/>
-                                <w:color w:val="000000"/>
-                                <w:lang w:val="en-US"/>
-                              </w:rPr>
-                              <w:t>IV</w:t>
-                            </w:r>
-                            <w:r>
-                              <w:rPr>
-                                <w:rFonts w:ascii="Arial" w:hAnsi="Arial" w:cs="Arial"/>
-                                <w:b/>
-                                <w:bCs/>
-                                <w:color w:val="000000"/>
-                                <w:lang w:val="en-US"/>
-                              </w:rPr>
-                              <w:fldChar w:fldCharType="end"/>
-                            </w:r>
-                            <w:r>
-                              <w:rPr>
-                                <w:rFonts w:ascii="Arial" w:hAnsi="Arial" w:cs="Arial"/>
-                                <w:b/>
-                                <w:bCs/>
-                                <w:color w:val="000000"/>
-                                <w:lang w:val="en-US"/>
-                              </w:rPr>
-                              <w:t xml:space="preserve"> </w:t>
-                            </w:r>
-                            <w:r>
-                              <w:rPr>
-                                <w:rFonts w:ascii="Arial" w:hAnsi="Arial" w:cs="Arial"/>
-                                <w:b/>
-                                <w:bCs/>
-                                <w:color w:val="000000"/>
-                                <w:lang w:val="en-US"/>
-                              </w:rPr>
-                              <w:fldChar w:fldCharType="begin"/>
-                            </w:r>
-                            <w:r>
-                              <w:rPr>
-                                <w:rFonts w:ascii="Arial" w:hAnsi="Arial" w:cs="Arial"/>
-                                <w:b/>
-                                <w:bCs/>
-                                <w:color w:val="000000"/>
-                                <w:lang w:val="en-US"/>
-                              </w:rPr>
-                              <w:instrText xml:space="preserve"> MERGEFIELD F4 </w:instrText>
-                            </w:r>
-                            <w:r>
-                              <w:rPr>
-                                <w:rFonts w:ascii="Arial" w:hAnsi="Arial" w:cs="Arial"/>
-                                <w:b/>
-                                <w:bCs/>
-                                <w:color w:val="000000"/>
-                                <w:lang w:val="en-US"/>
-                              </w:rPr>
-                              <w:fldChar w:fldCharType="separate"/>
-                            </w:r>
-                            <w:r>
-                              <w:rPr>
-                                <w:rFonts w:ascii="Arial" w:hAnsi="Arial" w:cs="Arial"/>
-                                <w:b/>
-                                <w:bCs/>
-                                <w:noProof/>
-                                <w:color w:val="000000"/>
-                                <w:lang w:val="en-US"/>
-                              </w:rPr>
-                              <w:t>19</w:t>
-                            </w:r>
-                            <w:r>
-                              <w:rPr>
-                                <w:rFonts w:ascii="Arial" w:hAnsi="Arial" w:cs="Arial"/>
-                                <w:b/>
-                                <w:bCs/>
-                                <w:color w:val="000000"/>
-                                <w:lang w:val="en-US"/>
-                              </w:rPr>
-                              <w:fldChar w:fldCharType="end"/>
+                              <w:t>{{ room_number }}</w:t>
                             </w:r>
                           </w:p>
                           <w:p>
@@ -1361,7 +1097,7 @@
                                 <w:color w:val="000000"/>
                                 <w:lang w:val="en-US"/>
                               </w:rPr>
-                              <w:t>Cibeureum</w:t>
+                              <w:t>{{ rusunawa }}</w:t>
                             </w:r>
                           </w:p>
                           <w:p>
@@ -1566,48 +1302,7 @@
                           <w:color w:val="000000"/>
                           <w:lang w:val="id-ID"/>
                         </w:rPr>
-                        <w:fldChar w:fldCharType="begin"/>
-                      </w:r>
-                      <w:r>
-                        <w:rPr>
-                          <w:rFonts w:ascii="Arial" w:hAnsi="Arial" w:cs="Arial"/>
-                          <w:b/>
-                          <w:bCs/>
-                          <w:color w:val="000000"/>
-                          <w:lang w:val="id-ID"/>
-                        </w:rPr>
-                        <w:instrText xml:space="preserve"> MERGEFIELD NAMA__PENGHUNI </w:instrText>
-                      </w:r>
-                      <w:r>
-                        <w:rPr>
-                          <w:rFonts w:ascii="Arial" w:hAnsi="Arial" w:cs="Arial"/>
-                          <w:b/>
-                          <w:bCs/>
-                          <w:color w:val="000000"/>
-                          <w:lang w:val="id-ID"/>
-                        </w:rPr>
-                        <w:fldChar w:fldCharType="separate"/>
-                      </w:r>
-                      <w:r>
-                        <w:rPr>
-                          <w:rFonts w:ascii="Arial" w:hAnsi="Arial" w:cs="Arial"/>
-                          <w:b/>
-                          <w:bCs/>
-                          <w:noProof/>
-                          <w:color w:val="000000"/>
-                          <w:lang w:val="id-ID"/>
-                        </w:rPr>
-                        <w:t>Dian pertiwi (lala)</w:t>
-                      </w:r>
-                      <w:r>
-                        <w:rPr>
-                          <w:rFonts w:ascii="Arial" w:hAnsi="Arial" w:cs="Arial"/>
-                          <w:b/>
-                          <w:bCs/>
-                          <w:color w:val="000000"/>
-                          <w:lang w:val="id-ID"/>
-                        </w:rPr>
-                        <w:fldChar w:fldCharType="end"/>
+                        <w:t>{{ nama_penyewa }}</w:t>
                       </w:r>
                     </w:p>
                     <w:p>
@@ -1680,170 +1375,7 @@
                           <w:color w:val="000000"/>
                           <w:lang w:val="id-ID"/>
                         </w:rPr>
-                        <w:fldChar w:fldCharType="begin"/>
-                      </w:r>
-                      <w:r>
-                        <w:rPr>
-                          <w:rFonts w:ascii="Arial" w:hAnsi="Arial" w:cs="Arial"/>
-                          <w:b/>
-                          <w:bCs/>
-                          <w:color w:val="000000"/>
-                          <w:lang w:val="id-ID"/>
-                        </w:rPr>
-                        <w:instrText xml:space="preserve"> MERGEFIELD NOMOR__HUNIAN </w:instrText>
-                      </w:r>
-                      <w:r>
-                        <w:rPr>
-                          <w:rFonts w:ascii="Arial" w:hAnsi="Arial" w:cs="Arial"/>
-                          <w:b/>
-                          <w:bCs/>
-                          <w:color w:val="000000"/>
-                          <w:lang w:val="id-ID"/>
-                        </w:rPr>
-                        <w:fldChar w:fldCharType="separate"/>
-                      </w:r>
-                      <w:r>
-                        <w:rPr>
-                          <w:rFonts w:ascii="Arial" w:hAnsi="Arial" w:cs="Arial"/>
-                          <w:b/>
-                          <w:bCs/>
-                          <w:noProof/>
-                          <w:color w:val="000000"/>
-                          <w:lang w:val="id-ID"/>
-                        </w:rPr>
-                        <w:t>D</w:t>
-                      </w:r>
-                      <w:r>
-                        <w:rPr>
-                          <w:rFonts w:ascii="Arial" w:hAnsi="Arial" w:cs="Arial"/>
-                          <w:b/>
-                          <w:bCs/>
-                          <w:color w:val="000000"/>
-                          <w:lang w:val="id-ID"/>
-                        </w:rPr>
-                        <w:fldChar w:fldCharType="end"/>
-                      </w:r>
-                      <w:r>
-                        <w:rPr>
-                          <w:rFonts w:ascii="Arial" w:hAnsi="Arial" w:cs="Arial"/>
-                          <w:b/>
-                          <w:bCs/>
-                          <w:color w:val="000000"/>
-                          <w:lang w:val="en-US"/>
-                        </w:rPr>
-                        <w:t xml:space="preserve"> </w:t>
-                      </w:r>
-                      <w:r>
-                        <w:rPr>
-                          <w:rFonts w:ascii="Arial" w:hAnsi="Arial" w:cs="Arial"/>
-                          <w:b/>
-                          <w:bCs/>
-                          <w:color w:val="000000"/>
-                          <w:lang w:val="en-US"/>
-                        </w:rPr>
-                        <w:fldChar w:fldCharType="begin"/>
-                      </w:r>
-                      <w:r>
-                        <w:rPr>
-                          <w:rFonts w:ascii="Arial" w:hAnsi="Arial" w:cs="Arial"/>
-                          <w:b/>
-                          <w:bCs/>
-                          <w:color w:val="000000"/>
-                          <w:lang w:val="en-US"/>
-                        </w:rPr>
-                        <w:instrText xml:space="preserve"> MERGEFIELD F3 </w:instrText>
-                      </w:r>
-                      <w:r>
-                        <w:rPr>
-                          <w:rFonts w:ascii="Arial" w:hAnsi="Arial" w:cs="Arial"/>
-                          <w:b/>
-                          <w:bCs/>
-                          <w:color w:val="000000"/>
-                          <w:lang w:val="en-US"/>
-                        </w:rPr>
-                        <w:fldChar w:fldCharType="separate"/>
-                      </w:r>
-                      <w:r>
-                        <w:rPr>
-                          <w:rFonts w:ascii="Arial" w:hAnsi="Arial" w:cs="Arial"/>
-                          <w:b/>
-                          <w:bCs/>
-                          <w:noProof/>
-                          <w:color w:val="000000"/>
-                          <w:lang w:val="en-US"/>
-                        </w:rPr>
-                        <w:t>IV</w:t>
-                      </w:r>
-                      <w:r>
-                        <w:rPr>
-                          <w:rFonts w:ascii="Arial" w:hAnsi="Arial" w:cs="Arial"/>
-                          <w:b/>
-                          <w:bCs/>
-                          <w:color w:val="000000"/>
-                          <w:lang w:val="en-US"/>
-                        </w:rPr>
-                        <w:fldChar w:fldCharType="end"/>
-                      </w:r>
-                      <w:r>
-                        <w:rPr>
-                          <w:rFonts w:ascii="Arial" w:hAnsi="Arial" w:cs="Arial"/>
-                          <w:b/>
-                          <w:bCs/>
-                          <w:color w:val="000000"/>
-                          <w:lang w:val="en-US"/>
-                        </w:rPr>
-                        <w:t xml:space="preserve"> </w:t>
-                      </w:r>
-                      <w:r>
-                        <w:rPr>
-                          <w:rFonts w:ascii="Arial" w:hAnsi="Arial" w:cs="Arial"/>
-                          <w:b/>
-                          <w:bCs/>
-                          <w:color w:val="000000"/>
-                          <w:lang w:val="en-US"/>
-                        </w:rPr>
-                        <w:fldChar w:fldCharType="begin"/>
-                      </w:r>
-                      <w:r>
-                        <w:rPr>
-                          <w:rFonts w:ascii="Arial" w:hAnsi="Arial" w:cs="Arial"/>
-                          <w:b/>
-                          <w:bCs/>
-                          <w:color w:val="000000"/>
-                          <w:lang w:val="en-US"/>
-                        </w:rPr>
-                        <w:instrText xml:space="preserve"> MERGEFIELD F4 </w:instrText>
-                      </w:r>
-                      <w:r>
-                        <w:rPr>
-                          <w:rFonts w:ascii="Arial" w:hAnsi="Arial" w:cs="Arial"/>
-                          <w:b/>
-                          <w:bCs/>
-                          <w:color w:val="000000"/>
-                          <w:lang w:val="en-US"/>
-                        </w:rPr>
-                        <w:fldChar w:fldCharType="separate"/>
-                      </w:r>
-                      <w:r>
-                        <w:rPr>
-                          <w:rFonts w:ascii="Arial" w:hAnsi="Arial" w:cs="Arial"/>
-                          <w:b/>
-                          <w:bCs/>
-                          <w:noProof/>
-                          <w:color w:val="000000"/>
-                          <w:lang w:val="en-US"/>
-                        </w:rPr>
-                        <w:t>19</w:t>
-                      </w:r>
-                      <w:r>
-                        <w:rPr>
-                          <w:rFonts w:ascii="Arial" w:hAnsi="Arial" w:cs="Arial"/>
-                          <w:b/>
-                          <w:bCs/>
-                          <w:color w:val="000000"/>
-                          <w:lang w:val="en-US"/>
-                        </w:rPr>
-                        <w:fldChar w:fldCharType="end"/>
+                        <w:t>{{ room_number }}</w:t>
                       </w:r>
                     </w:p>
                     <w:p>
@@ -1886,7 +1418,7 @@
                           <w:color w:val="000000"/>
                           <w:lang w:val="en-US"/>
                         </w:rPr>
-                        <w:t>Cibeureum</w:t>
+                        <w:t>{{ rusunawa }}</w:t>
                       </w:r>
                     </w:p>
                     <w:p>
@@ -2079,144 +1611,7 @@
           <w:color w:val="0000FF"/>
           <w:lang w:val="id-ID"/>
         </w:rPr>
-        <w:t>974</w:t>
-      </w:r>
-      <w:r>
-        <w:rPr>
-          <w:rFonts w:ascii="Arial" w:hAnsi="Arial" w:cs="Arial"/>
-          <w:color w:val="0000FF"/>
-          <w:lang w:val="en-US"/>
-        </w:rPr>
-        <w:t>/</w:t>
-      </w:r>
-      <w:r>
-        <w:rPr>
-          <w:rFonts w:ascii="Arial" w:hAnsi="Arial" w:cs="Arial"/>
-          <w:color w:val="0000FF"/>
-          <w:lang w:val="en-US"/>
-        </w:rPr>
-        <w:t>T</w:t>
-      </w:r>
-      <w:r>
-        <w:rPr>
-          <w:rFonts w:ascii="Arial" w:hAnsi="Arial" w:cs="Arial"/>
-          <w:color w:val="0000FF"/>
-          <w:lang w:val="en-US"/>
-        </w:rPr>
-        <w:t>1</w:t>
-      </w:r>
-      <w:r>
-        <w:rPr>
-          <w:rFonts w:ascii="Arial" w:hAnsi="Arial" w:cs="Arial"/>
-          <w:color w:val="0000FF"/>
-          <w:lang w:val="en-US"/>
-        </w:rPr>
-        <w:t>/02.</w:t>
-      </w:r>
-      <w:r>
-        <w:rPr>
-          <w:rFonts w:ascii="Arial" w:hAnsi="Arial" w:cs="Arial"/>
-          <w:color w:val="0000FF"/>
-          <w:lang w:val="en-US"/>
-        </w:rPr>
-        <w:fldChar w:fldCharType="begin"/>
-      </w:r>
-      <w:r>
-        <w:rPr>
-          <w:rFonts w:ascii="Arial" w:hAnsi="Arial" w:cs="Arial"/>
-          <w:color w:val="0000FF"/>
-          <w:lang w:val="en-US"/>
-        </w:rPr>
-        <w:instrText xml:space="preserve"> MERGEFIELD URUTAN </w:instrText>
-      </w:r>
-      <w:r>
-        <w:rPr>
-          <w:rFonts w:ascii="Arial" w:hAnsi="Arial" w:cs="Arial"/>
-          <w:color w:val="0000FF"/>
-          <w:lang w:val="en-US"/>
-        </w:rPr>
-        <w:fldChar w:fldCharType="separate"/>
-      </w:r>
-      <w:r>
-        <w:rPr>
-          <w:rFonts w:ascii="Arial" w:hAnsi="Arial" w:cs="Arial"/>
-          <w:noProof/>
-          <w:color w:val="0000FF"/>
-          <w:lang w:val="en-US"/>
-        </w:rPr>
-        <w:t>1120</w:t>
-      </w:r>
-      <w:r>
-        <w:rPr>
-          <w:rFonts w:ascii="Arial" w:hAnsi="Arial" w:cs="Arial"/>
-          <w:color w:val="0000FF"/>
-          <w:lang w:val="en-US"/>
-        </w:rPr>
-        <w:fldChar w:fldCharType="end"/>
-      </w:r>
-      <w:r>
-        <w:rPr>
-          <w:rFonts w:ascii="Arial" w:hAnsi="Arial" w:cs="Arial"/>
-          <w:color w:val="0000FF"/>
-          <w:lang w:val="en-US"/>
-        </w:rPr>
-        <w:t>/UPT</w:t>
-      </w:r>
-      <w:r>
-        <w:rPr>
-          <w:rFonts w:ascii="Arial" w:hAnsi="Arial" w:cs="Arial"/>
-          <w:color w:val="0000FF"/>
-          <w:lang w:val="id-ID"/>
-        </w:rPr>
-        <w:t>D</w:t>
-      </w:r>
-      <w:r>
-        <w:rPr>
-          <w:rFonts w:ascii="Arial" w:hAnsi="Arial" w:cs="Arial"/>
-          <w:color w:val="0000FF"/>
-          <w:lang w:val="en-US"/>
-        </w:rPr>
-        <w:t>.RSN</w:t>
-      </w:r>
-      <w:r>
-        <w:rPr>
-          <w:rFonts w:ascii="Arial" w:hAnsi="Arial" w:cs="Arial"/>
-          <w:color w:val="0000FF"/>
-          <w:lang w:val="en-US"/>
-        </w:rPr>
-        <w:t>/</w:t>
-      </w:r>
-      <w:r>
-        <w:rPr>
-          <w:rFonts w:ascii="Arial" w:hAnsi="Arial" w:cs="Arial"/>
-          <w:color w:val="0000FF"/>
-          <w:lang w:val="en-US"/>
-        </w:rPr>
-        <w:t>I</w:t>
-      </w:r>
-      <w:r>
-        <w:rPr>
-          <w:rFonts w:ascii="Arial" w:hAnsi="Arial" w:cs="Arial"/>
-          <w:color w:val="0000FF"/>
-          <w:lang w:val="en-US"/>
-        </w:rPr>
-        <w:t>/</w:t>
-      </w:r>
-      <w:r>
-        <w:rPr>
-          <w:rFonts w:ascii="Arial" w:hAnsi="Arial" w:cs="Arial"/>
-          <w:color w:val="0000FF"/>
-          <w:lang w:val="en-US"/>
-        </w:rPr>
-        <w:t>202</w:t>
-      </w:r>
-      <w:r>
-        <w:rPr>
-          <w:rFonts w:ascii="Arial" w:hAnsi="Arial" w:cs="Arial"/>
-          <w:color w:val="0000FF"/>
-          <w:lang w:val="en-US"/>
-        </w:rPr>
-        <w:t>6</w:t>
+        <w:t>{{ nomor_surat }}</w:t>
       </w:r>
       <w:r>
         <w:rPr>
@@ -2856,44 +2251,69 @@
           <w:szCs w:val="22"/>
           <w:lang w:val="en-US"/>
         </w:rPr>
-        <w:fldChar w:fldCharType="begin"/>
-      </w:r>
-      <w:r>
-        <w:rPr>
-          <w:rFonts w:ascii="Arial" w:hAnsi="Arial" w:cs="Arial"/>
-          <w:b/>
-          <w:bCs/>
+        <w:t>{{ nama_penyewa }}</w:t>
+      </w:r>
+      <w:r>
+        <w:rPr>
+          <w:rFonts w:ascii="Arial" w:hAnsi="Arial" w:cs="Arial"/>
           <w:color w:val="000000"/>
           <w:sz w:val="22"/>
           <w:szCs w:val="22"/>
           <w:lang w:val="en-US"/>
         </w:rPr>
-        <w:instrText xml:space="preserve"> MERGEFIELD NAMA__PENGHUNI </w:instrText>
-      </w:r>
-      <w:r>
-        <w:rPr>
-          <w:rFonts w:ascii="Arial" w:hAnsi="Arial" w:cs="Arial"/>
-          <w:b/>
-          <w:bCs/>
+        <w:t xml:space="preserve"> </w:t>
+      </w:r>
+      <w:r>
+        <w:rPr>
+          <w:rFonts w:ascii="Arial" w:hAnsi="Arial" w:cs="Arial"/>
+          <w:color w:val="000000"/>
+          <w:sz w:val="22"/>
+          <w:szCs w:val="22"/>
+          <w:lang w:val="id-ID"/>
+        </w:rPr>
+        <w:t>Penghuni Rusunawa</w:t>
+      </w:r>
+      <w:r>
+        <w:rPr>
+          <w:rFonts w:ascii="Arial" w:hAnsi="Arial" w:cs="Arial"/>
           <w:color w:val="000000"/>
           <w:sz w:val="22"/>
           <w:szCs w:val="22"/>
           <w:lang w:val="en-US"/>
         </w:rPr>
-        <w:fldChar w:fldCharType="separate"/>
+        <w:t xml:space="preserve"> </w:t>
       </w:r>
       <w:r>
         <w:rPr>
           <w:rFonts w:ascii="Arial" w:hAnsi="Arial" w:cs="Arial"/>
           <w:b/>
-          <w:bCs/>
-          <w:noProof/>
+          <w:color w:val="000000"/>
+          <w:sz w:val="22"/>
+          <w:szCs w:val="22"/>
+          <w:lang w:val="id-ID"/>
+        </w:rPr>
+        <w:t>{{ rusunawa }}</w:t>
+      </w:r>
+      <w:r>
+        <w:rPr>
+          <w:rFonts w:ascii="Arial" w:hAnsi="Arial" w:cs="Arial"/>
+          <w:b/>
+          <w:color w:val="000000"/>
+          <w:sz w:val="22"/>
+          <w:szCs w:val="22"/>
+          <w:lang w:val="id-ID"/>
+        </w:rPr>
+        <w:t xml:space="preserve"> </w:t>
+      </w:r>
+      <w:r>
+        <w:rPr>
+          <w:rFonts w:ascii="Arial" w:hAnsi="Arial" w:cs="Arial"/>
           <w:color w:val="000000"/>
           <w:sz w:val="22"/>
           <w:szCs w:val="22"/>
           <w:lang w:val="en-US"/>
         </w:rPr>
-        <w:t>Dian pertiwi (lala)</w:t>
+        <w:t xml:space="preserve">hunian </w:t>
       </w:r>
       <w:r>
         <w:rPr>
@@ -2905,265 +2325,7 @@
           <w:szCs w:val="22"/>
           <w:lang w:val="en-US"/>
         </w:rPr>
-        <w:fldChar w:fldCharType="end"/>
-      </w:r>
-      <w:r>
-        <w:rPr>
-          <w:rFonts w:ascii="Arial" w:hAnsi="Arial" w:cs="Arial"/>
-          <w:color w:val="000000"/>
-          <w:sz w:val="22"/>
-          <w:szCs w:val="22"/>
-          <w:lang w:val="en-US"/>
-        </w:rPr>
-        <w:t xml:space="preserve"> </w:t>
-      </w:r>
-      <w:r>
-        <w:rPr>
-          <w:rFonts w:ascii="Arial" w:hAnsi="Arial" w:cs="Arial"/>
-          <w:color w:val="000000"/>
-          <w:sz w:val="22"/>
-          <w:szCs w:val="22"/>
-          <w:lang w:val="id-ID"/>
-        </w:rPr>
-        <w:t>Penghuni Rusunawa</w:t>
-      </w:r>
-      <w:r>
-        <w:rPr>
-          <w:rFonts w:ascii="Arial" w:hAnsi="Arial" w:cs="Arial"/>
-          <w:color w:val="000000"/>
-          <w:sz w:val="22"/>
-          <w:szCs w:val="22"/>
-          <w:lang w:val="en-US"/>
-        </w:rPr>
-        <w:t xml:space="preserve"> </w:t>
-      </w:r>
-      <w:r>
-        <w:rPr>
-          <w:rFonts w:ascii="Arial" w:hAnsi="Arial" w:cs="Arial"/>
-          <w:b/>
-          <w:color w:val="000000"/>
-          <w:sz w:val="22"/>
-          <w:szCs w:val="22"/>
-          <w:lang w:val="id-ID"/>
-        </w:rPr>
-        <w:t>Cibeureum</w:t>
-      </w:r>
-      <w:r>
-        <w:rPr>
-          <w:rFonts w:ascii="Arial" w:hAnsi="Arial" w:cs="Arial"/>
-          <w:color w:val="000000"/>
-          <w:sz w:val="22"/>
-          <w:szCs w:val="22"/>
-          <w:lang w:val="en-US"/>
-        </w:rPr>
-        <w:t xml:space="preserve"> hunian </w:t>
-      </w:r>
-      <w:r>
-        <w:rPr>
-          <w:rFonts w:ascii="Arial" w:hAnsi="Arial" w:cs="Arial"/>
-          <w:b/>
-          <w:bCs/>
-          <w:color w:val="000000"/>
-          <w:sz w:val="22"/>
-          <w:szCs w:val="22"/>
-          <w:lang w:val="en-US"/>
-        </w:rPr>
-        <w:fldChar w:fldCharType="begin"/>
-      </w:r>
-      <w:r>
-        <w:rPr>
-          <w:rFonts w:ascii="Arial" w:hAnsi="Arial" w:cs="Arial"/>
-          <w:b/>
-          <w:bCs/>
-          <w:color w:val="000000"/>
-          <w:sz w:val="22"/>
-          <w:szCs w:val="22"/>
-          <w:lang w:val="en-US"/>
-        </w:rPr>
-        <w:instrText xml:space="preserve"> MERGEFIELD NOMOR__HUNIAN </w:instrText>
-      </w:r>
-      <w:r>
-        <w:rPr>
-          <w:rFonts w:ascii="Arial" w:hAnsi="Arial" w:cs="Arial"/>
-          <w:b/>
-          <w:bCs/>
-          <w:color w:val="000000"/>
-          <w:sz w:val="22"/>
-          <w:szCs w:val="22"/>
-          <w:lang w:val="en-US"/>
-        </w:rPr>
-        <w:fldChar w:fldCharType="separate"/>
-      </w:r>
-      <w:r>
-        <w:rPr>
-          <w:rFonts w:ascii="Arial" w:hAnsi="Arial" w:cs="Arial"/>
-          <w:b/>
-          <w:bCs/>
-          <w:noProof/>
-          <w:color w:val="000000"/>
-          <w:sz w:val="22"/>
-          <w:szCs w:val="22"/>
-          <w:lang w:val="en-US"/>
-        </w:rPr>
-        <w:t>D</w:t>
-      </w:r>
-      <w:r>
-        <w:rPr>
-          <w:rFonts w:ascii="Arial" w:hAnsi="Arial" w:cs="Arial"/>
-          <w:b/>
-          <w:bCs/>
-          <w:color w:val="000000"/>
-          <w:sz w:val="22"/>
-          <w:szCs w:val="22"/>
-          <w:lang w:val="en-US"/>
-        </w:rPr>
-        <w:fldChar w:fldCharType="end"/>
-      </w:r>
-      <w:r>
-        <w:rPr>
-          <w:rFonts w:ascii="Arial" w:hAnsi="Arial" w:cs="Arial"/>
-          <w:b/>
-          <w:bCs/>
-          <w:color w:val="000000"/>
-          <w:sz w:val="22"/>
-          <w:szCs w:val="22"/>
-          <w:lang w:val="en-US"/>
-        </w:rPr>
-        <w:t xml:space="preserve"> </w:t>
-      </w:r>
-      <w:r>
-        <w:rPr>
-          <w:rFonts w:ascii="Arial" w:hAnsi="Arial" w:cs="Arial"/>
-          <w:b/>
-          <w:bCs/>
-          <w:color w:val="000000"/>
-          <w:sz w:val="22"/>
-          <w:szCs w:val="22"/>
-          <w:lang w:val="en-US"/>
-        </w:rPr>
-        <w:fldChar w:fldCharType="begin"/>
-      </w:r>
-      <w:r>
-        <w:rPr>
-          <w:rFonts w:ascii="Arial" w:hAnsi="Arial" w:cs="Arial"/>
-          <w:b/>
-          <w:bCs/>
-          <w:color w:val="000000"/>
-          <w:sz w:val="22"/>
-          <w:szCs w:val="22"/>
-          <w:lang w:val="en-US"/>
-        </w:rPr>
-        <w:instrText xml:space="preserve"> MERGEFIELD F3 </w:instrText>
-      </w:r>
-      <w:r>
-        <w:rPr>
-          <w:rFonts w:ascii="Arial" w:hAnsi="Arial" w:cs="Arial"/>
-          <w:b/>
-          <w:bCs/>
-          <w:color w:val="000000"/>
-          <w:sz w:val="22"/>
-          <w:szCs w:val="22"/>
-          <w:lang w:val="en-US"/>
-        </w:rPr>
-        <w:fldChar w:fldCharType="separate"/>
-      </w:r>
-      <w:r>
-        <w:rPr>
-          <w:rFonts w:ascii="Arial" w:hAnsi="Arial" w:cs="Arial"/>
-          <w:b/>
-          <w:bCs/>
-          <w:noProof/>
-          <w:color w:val="000000"/>
-          <w:sz w:val="22"/>
-          <w:szCs w:val="22"/>
-          <w:lang w:val="en-US"/>
-        </w:rPr>
-        <w:t>IV</w:t>
-      </w:r>
-      <w:r>
-        <w:rPr>
-          <w:rFonts w:ascii="Arial" w:hAnsi="Arial" w:cs="Arial"/>
-          <w:b/>
-          <w:bCs/>
-          <w:color w:val="000000"/>
-          <w:sz w:val="22"/>
-          <w:szCs w:val="22"/>
-          <w:lang w:val="en-US"/>
-        </w:rPr>
-        <w:fldChar w:fldCharType="end"/>
-      </w:r>
-      <w:r>
-        <w:rPr>
-          <w:rFonts w:ascii="Arial" w:hAnsi="Arial" w:cs="Arial"/>
-          <w:b/>
-          <w:bCs/>
-          <w:color w:val="000000"/>
-          <w:sz w:val="22"/>
-          <w:szCs w:val="22"/>
-          <w:lang w:val="en-US"/>
-        </w:rPr>
-        <w:t xml:space="preserve"> </w:t>
-      </w:r>
-      <w:r>
-        <w:rPr>
-          <w:rFonts w:ascii="Arial" w:hAnsi="Arial" w:cs="Arial"/>
-          <w:b/>
-          <w:bCs/>
-          <w:color w:val="000000"/>
-          <w:sz w:val="22"/>
-          <w:szCs w:val="22"/>
-          <w:lang w:val="en-US"/>
-        </w:rPr>
-        <w:fldChar w:fldCharType="begin"/>
-      </w:r>
-      <w:r>
-        <w:rPr>
-          <w:rFonts w:ascii="Arial" w:hAnsi="Arial" w:cs="Arial"/>
-          <w:b/>
-          <w:bCs/>
-          <w:color w:val="000000"/>
-          <w:sz w:val="22"/>
-          <w:szCs w:val="22"/>
-          <w:lang w:val="en-US"/>
-        </w:rPr>
-        <w:instrText xml:space="preserve"> MERGEFIELD F4 </w:instrText>
-      </w:r>
-      <w:r>
-        <w:rPr>
-          <w:rFonts w:ascii="Arial" w:hAnsi="Arial" w:cs="Arial"/>
-          <w:b/>
-          <w:bCs/>
-          <w:color w:val="000000"/>
-          <w:sz w:val="22"/>
-          <w:szCs w:val="22"/>
-          <w:lang w:val="en-US"/>
-        </w:rPr>
-        <w:fldChar w:fldCharType="separate"/>
-      </w:r>
-      <w:r>
-        <w:rPr>
-          <w:rFonts w:ascii="Arial" w:hAnsi="Arial" w:cs="Arial"/>
-          <w:b/>
-          <w:bCs/>
-          <w:noProof/>
-          <w:color w:val="000000"/>
-          <w:sz w:val="22"/>
-          <w:szCs w:val="22"/>
-          <w:lang w:val="en-US"/>
-        </w:rPr>
-        <w:t>19</w:t>
-      </w:r>
-      <w:r>
-        <w:rPr>
-          <w:rFonts w:ascii="Arial" w:hAnsi="Arial" w:cs="Arial"/>
-          <w:b/>
-          <w:bCs/>
-          <w:color w:val="000000"/>
-          <w:sz w:val="22"/>
-          <w:szCs w:val="22"/>
-          <w:lang w:val="en-US"/>
-        </w:rPr>
-        <w:fldChar w:fldCharType="end"/>
+        <w:t>{{ alamat_hunian }}</w:t>
       </w:r>
       <w:r>
         <w:rPr>
@@ -3196,7 +2358,7 @@
           <w:szCs w:val="22"/>
           <w:lang w:val="en-US"/>
         </w:rPr>
-        <w:t>03</w:t>
+        <w:t>{{ tenggat_bayar }}</w:t>
       </w:r>
       <w:r>
         <w:rPr>
@@ -3208,29 +2370,6 @@
           <w:szCs w:val="22"/>
           <w:lang w:val="en-US"/>
         </w:rPr>
-        <w:t xml:space="preserve"> Februari 202</w:t>
-      </w:r>
-      <w:r>
-        <w:rPr>
-          <w:rFonts w:ascii="Arial" w:hAnsi="Arial" w:cs="Arial"/>
-          <w:b/>
-          <w:bCs/>
-          <w:color w:val="0000FF"/>
-          <w:sz w:val="22"/>
-          <w:szCs w:val="22"/>
-          <w:lang w:val="en-US"/>
-        </w:rPr>
-        <w:t>6</w:t>
-      </w:r>
-      <w:r>
-        <w:rPr>
-          <w:rFonts w:ascii="Arial" w:hAnsi="Arial" w:cs="Arial"/>
-          <w:b/>
-          <w:color w:val="000000"/>
-          <w:sz w:val="22"/>
-          <w:szCs w:val="22"/>
-          <w:lang w:val="id-ID"/>
-        </w:rPr>
         <w:t xml:space="preserve"> </w:t>
       </w:r>
       <w:r>
@@ -3276,7 +2415,7 @@
     </w:p>
     <w:tbl>
       <w:tblPr>
-        <w:tblW w:w="0" w:type="auto"/>
+        <w:tblW w:w="7751" w:type="dxa"/>
         <w:tblInd w:w="1526" w:type="dxa"/>
         <w:tblBorders>
           <w:top w:val="single" w:sz="4" w:space="0" w:color="auto"/>
@@ -3289,16 +2428,16 @@
         <w:tblLook w:val="04A0" w:firstRow="1" w:lastRow="0" w:firstColumn="1" w:lastColumn="0" w:noHBand="0" w:noVBand="1"/>
       </w:tblPr>
       <w:tblGrid>
-        <w:gridCol w:w="641"/>
-        <w:gridCol w:w="2042"/>
-        <w:gridCol w:w="1424"/>
-        <w:gridCol w:w="1323"/>
-        <w:gridCol w:w="2042"/>
+        <w:gridCol w:w="555"/>
+        <w:gridCol w:w="2592"/>
+        <w:gridCol w:w="1455"/>
+        <w:gridCol w:w="1261"/>
+        <w:gridCol w:w="1888"/>
       </w:tblGrid>
       <w:tr>
         <w:tc>
           <w:tcPr>
-            <w:tcW w:w="661" w:type="dxa"/>
+            <w:tcW w:w="555" w:type="dxa"/>
           </w:tcPr>
           <w:p>
             <w:pPr>
@@ -3328,7 +2467,7 @@
         </w:tc>
         <w:tc>
           <w:tcPr>
-            <w:tcW w:w="2235" w:type="dxa"/>
+            <w:tcW w:w="2592" w:type="dxa"/>
           </w:tcPr>
           <w:p>
             <w:pPr>
@@ -3358,7 +2497,7 @@
         </w:tc>
         <w:tc>
           <w:tcPr>
-            <w:tcW w:w="1498" w:type="dxa"/>
+            <w:tcW w:w="1455" w:type="dxa"/>
           </w:tcPr>
           <w:p>
             <w:pPr>
@@ -3388,7 +2527,7 @@
         </w:tc>
         <w:tc>
           <w:tcPr>
-            <w:tcW w:w="1402" w:type="dxa"/>
+            <w:tcW w:w="1261" w:type="dxa"/>
           </w:tcPr>
           <w:p>
             <w:pPr>
@@ -3418,7 +2557,7 @@
         </w:tc>
         <w:tc>
           <w:tcPr>
-            <w:tcW w:w="2235" w:type="dxa"/>
+            <w:tcW w:w="1888" w:type="dxa"/>
           </w:tcPr>
           <w:p>
             <w:pPr>
@@ -3450,7 +2589,7 @@
       <w:tr>
         <w:tc>
           <w:tcPr>
-            <w:tcW w:w="661" w:type="dxa"/>
+            <w:tcW w:w="555" w:type="dxa"/>
           </w:tcPr>
           <w:p>
             <w:pPr>
@@ -3478,7 +2617,7 @@
         </w:tc>
         <w:tc>
           <w:tcPr>
-            <w:tcW w:w="2235" w:type="dxa"/>
+            <w:tcW w:w="2592" w:type="dxa"/>
           </w:tcPr>
           <w:p>
             <w:pPr>
@@ -3486,8 +2625,6 @@
               <w:jc w:val="center"/>
               <w:rPr>
                 <w:rFonts w:ascii="Tahoma" w:hAnsi="Tahoma" w:cs="Tahoma"/>
-                <w:b/>
-                <w:bCs/>
                 <w:color w:val="0000FF"/>
                 <w:sz w:val="22"/>
                 <w:szCs w:val="22"/>
@@ -3497,221 +2634,38 @@
             <w:r>
               <w:rPr>
                 <w:rFonts w:ascii="Tahoma" w:hAnsi="Tahoma" w:cs="Tahoma"/>
-                <w:b/>
-                <w:bCs/>
                 <w:color w:val="0000FF"/>
                 <w:sz w:val="22"/>
                 <w:szCs w:val="22"/>
                 <w:lang w:val="en-US"/>
               </w:rPr>
-              <w:t>Januari 202</w:t>
+              <w:t>{{ bulan_tagihan }}</w:t>
             </w:r>
             <w:r>
               <w:rPr>
                 <w:rFonts w:ascii="Tahoma" w:hAnsi="Tahoma" w:cs="Tahoma"/>
-                <w:b/>
-                <w:bCs/>
                 <w:color w:val="0000FF"/>
                 <w:sz w:val="22"/>
                 <w:szCs w:val="22"/>
                 <w:lang w:val="en-US"/>
               </w:rPr>
-              <w:t>6</w:t>
+              <w:t xml:space="preserve"> </w:t>
+            </w:r>
+            <w:r>
+              <w:rPr>
+                <w:rFonts w:ascii="Tahoma" w:hAnsi="Tahoma" w:cs="Tahoma"/>
+                <w:color w:val="0000FF"/>
+                <w:sz w:val="22"/>
+                <w:szCs w:val="22"/>
+                <w:lang w:val="en-US"/>
+              </w:rPr>
+              <w:t>{{ tahun_tagihan }}</w:t>
             </w:r>
           </w:p>
         </w:tc>
         <w:tc>
           <w:tcPr>
-            <w:tcW w:w="1498" w:type="dxa"/>
-          </w:tcPr>
-          <w:p>
-            <w:pPr>
-              <w:spacing w:line="360" w:lineRule="auto"/>
-              <w:jc w:val="center"/>
-              <w:rPr>
-                <w:rFonts w:ascii="Tahoma" w:hAnsi="Tahoma" w:cs="Tahoma"/>
-                <w:b/>
-                <w:bCs/>
-                <w:color w:val="000000"/>
-                <w:sz w:val="22"/>
-                <w:szCs w:val="22"/>
-                <w:lang w:val="it-IT"/>
-              </w:rPr>
-            </w:pPr>
-            <w:r>
-              <w:rPr>
-                <w:rFonts w:ascii="Tahoma" w:hAnsi="Tahoma" w:cs="Tahoma"/>
-                <w:b/>
-                <w:bCs/>
-                <w:color w:val="000000"/>
-                <w:sz w:val="22"/>
-                <w:szCs w:val="22"/>
-                <w:lang w:val="it-IT"/>
-              </w:rPr>
-              <w:fldChar w:fldCharType="begin"/>
-            </w:r>
-            <w:r>
-              <w:rPr>
-                <w:rFonts w:ascii="Tahoma" w:hAnsi="Tahoma" w:cs="Tahoma"/>
-                <w:b/>
-                <w:bCs/>
-                <w:color w:val="000000"/>
-                <w:sz w:val="22"/>
-                <w:szCs w:val="22"/>
-                <w:lang w:val="it-IT"/>
-              </w:rPr>
-              <w:instrText xml:space="preserve"> MERGEFIELD JUMLAH </w:instrText>
-            </w:r>
-            <w:r>
-              <w:rPr>
-                <w:rFonts w:ascii="Tahoma" w:hAnsi="Tahoma" w:cs="Tahoma"/>
-                <w:b/>
-                <w:color w:val="000000"/>
-                <w:sz w:val="22"/>
-                <w:szCs w:val="22"/>
-                <w:lang w:val="it-IT"/>
-              </w:rPr>
-              <w:instrText>\#  0,00</w:instrText>
-            </w:r>
-            <w:r>
-              <w:rPr>
-                <w:rFonts w:ascii="Tahoma" w:hAnsi="Tahoma" w:cs="Tahoma"/>
-                <w:b/>
-                <w:bCs/>
-                <w:color w:val="000000"/>
-                <w:sz w:val="22"/>
-                <w:szCs w:val="22"/>
-                <w:lang w:val="it-IT"/>
-              </w:rPr>
-              <w:instrText xml:space="preserve"> </w:instrText>
-            </w:r>
-            <w:r>
-              <w:rPr>
-                <w:rFonts w:ascii="Tahoma" w:hAnsi="Tahoma" w:cs="Tahoma"/>
-                <w:b/>
-                <w:bCs/>
-                <w:color w:val="000000"/>
-                <w:sz w:val="22"/>
-                <w:szCs w:val="22"/>
-                <w:lang w:val="it-IT"/>
-              </w:rPr>
-              <w:fldChar w:fldCharType="separate"/>
-            </w:r>
-            <w:r>
-              <w:rPr>
-                <w:rFonts w:ascii="Tahoma" w:hAnsi="Tahoma" w:cs="Tahoma"/>
-                <w:b/>
-                <w:noProof/>
-                <w:color w:val="000000"/>
-                <w:sz w:val="22"/>
-                <w:szCs w:val="22"/>
-                <w:lang w:val="it-IT"/>
-              </w:rPr>
-              <w:t>425,000</w:t>
-            </w:r>
-            <w:r>
-              <w:rPr>
-                <w:rFonts w:ascii="Tahoma" w:hAnsi="Tahoma" w:cs="Tahoma"/>
-                <w:b/>
-                <w:bCs/>
-                <w:color w:val="000000"/>
-                <w:sz w:val="22"/>
-                <w:szCs w:val="22"/>
-                <w:lang w:val="it-IT"/>
-              </w:rPr>
-              <w:fldChar w:fldCharType="end"/>
-            </w:r>
-          </w:p>
-        </w:tc>
-        <w:tc>
-          <w:tcPr>
-            <w:tcW w:w="1402" w:type="dxa"/>
-          </w:tcPr>
-          <w:p>
-            <w:pPr>
-              <w:spacing w:line="360" w:lineRule="auto"/>
-              <w:jc w:val="center"/>
-              <w:rPr>
-                <w:rFonts w:ascii="Tahoma" w:hAnsi="Tahoma" w:cs="Tahoma"/>
-                <w:b/>
-                <w:color w:val="000000"/>
-                <w:sz w:val="22"/>
-                <w:szCs w:val="22"/>
-                <w:lang w:val="it-IT"/>
-              </w:rPr>
-            </w:pPr>
-            <w:r>
-              <w:rPr>
-                <w:rFonts w:ascii="Tahoma" w:hAnsi="Tahoma" w:cs="Tahoma"/>
-                <w:b/>
-                <w:color w:val="000000"/>
-                <w:sz w:val="22"/>
-                <w:szCs w:val="22"/>
-                <w:lang w:val="it-IT"/>
-              </w:rPr>
-              <w:fldChar w:fldCharType="begin"/>
-            </w:r>
-            <w:r>
-              <w:rPr>
-                <w:rFonts w:ascii="Tahoma" w:hAnsi="Tahoma" w:cs="Tahoma"/>
-                <w:b/>
-                <w:color w:val="000000"/>
-                <w:sz w:val="22"/>
-                <w:szCs w:val="22"/>
-                <w:lang w:val="it-IT"/>
-              </w:rPr>
-              <w:instrText xml:space="preserve"> MERGEFIELD DENDA </w:instrText>
-            </w:r>
-            <w:r>
-              <w:rPr>
-                <w:rFonts w:ascii="Tahoma" w:hAnsi="Tahoma" w:cs="Tahoma"/>
-                <w:b/>
-                <w:color w:val="000000"/>
-                <w:sz w:val="22"/>
-                <w:szCs w:val="22"/>
-                <w:lang w:val="it-IT"/>
-              </w:rPr>
-              <w:instrText>\#  0,00</w:instrText>
-            </w:r>
-            <w:r>
-              <w:rPr>
-                <w:rFonts w:ascii="Tahoma" w:hAnsi="Tahoma" w:cs="Tahoma"/>
-                <w:b/>
-                <w:color w:val="000000"/>
-                <w:sz w:val="22"/>
-                <w:szCs w:val="22"/>
-                <w:lang w:val="it-IT"/>
-              </w:rPr>
-              <w:fldChar w:fldCharType="separate"/>
-            </w:r>
-            <w:r>
-              <w:rPr>
-                <w:rFonts w:ascii="Tahoma" w:hAnsi="Tahoma" w:cs="Tahoma"/>
-                <w:b/>
-                <w:noProof/>
-                <w:color w:val="000000"/>
-                <w:sz w:val="22"/>
-                <w:szCs w:val="22"/>
-                <w:lang w:val="it-IT"/>
-              </w:rPr>
-              <w:t>8,500</w:t>
-            </w:r>
-            <w:r>
-              <w:rPr>
-                <w:rFonts w:ascii="Tahoma" w:hAnsi="Tahoma" w:cs="Tahoma"/>
-                <w:b/>
-                <w:color w:val="000000"/>
-                <w:sz w:val="22"/>
-                <w:szCs w:val="22"/>
-                <w:lang w:val="it-IT"/>
-              </w:rPr>
-              <w:fldChar w:fldCharType="end"/>
-            </w:r>
-          </w:p>
-        </w:tc>
-        <w:tc>
-          <w:tcPr>
-            <w:tcW w:w="2235" w:type="dxa"/>
+            <w:tcW w:w="1455" w:type="dxa"/>
           </w:tcPr>
           <w:p>
             <w:pPr>
@@ -3733,8 +2687,26 @@
                 <w:szCs w:val="22"/>
                 <w:lang w:val="it-IT"/>
               </w:rPr>
-              <w:fldChar w:fldCharType="begin"/>
+              <w:t>{{ sewa_price }}</w:t>
             </w:r>
+          </w:p>
+        </w:tc>
+        <w:tc>
+          <w:tcPr>
+            <w:tcW w:w="1261" w:type="dxa"/>
+          </w:tcPr>
+          <w:p>
+            <w:pPr>
+              <w:spacing w:line="360" w:lineRule="auto"/>
+              <w:jc w:val="center"/>
+              <w:rPr>
+                <w:rFonts w:ascii="Tahoma" w:hAnsi="Tahoma" w:cs="Tahoma"/>
+                <w:color w:val="000000"/>
+                <w:sz w:val="22"/>
+                <w:szCs w:val="22"/>
+                <w:lang w:val="it-IT"/>
+              </w:rPr>
+            </w:pPr>
             <w:r>
               <w:rPr>
                 <w:rFonts w:ascii="Tahoma" w:hAnsi="Tahoma" w:cs="Tahoma"/>
@@ -3743,41 +2715,26 @@
                 <w:szCs w:val="22"/>
                 <w:lang w:val="it-IT"/>
               </w:rPr>
-              <w:instrText xml:space="preserve"> MERGEFIELD TOTAL_</w:instrText>
+              <w:t>{{ denda }}</w:t>
             </w:r>
-            <w:r>
+          </w:p>
+        </w:tc>
+        <w:tc>
+          <w:tcPr>
+            <w:tcW w:w="1888" w:type="dxa"/>
+          </w:tcPr>
+          <w:p>
+            <w:pPr>
+              <w:spacing w:line="360" w:lineRule="auto"/>
+              <w:jc w:val="center"/>
               <w:rPr>
                 <w:rFonts w:ascii="Tahoma" w:hAnsi="Tahoma" w:cs="Tahoma"/>
-                <w:b/>
                 <w:color w:val="000000"/>
                 <w:sz w:val="22"/>
                 <w:szCs w:val="22"/>
                 <w:lang w:val="it-IT"/>
               </w:rPr>
-              <w:instrText>\#  0</w:instrText>
-            </w:r>
-            <w:r>
-              <w:rPr>
-                <w:rFonts w:ascii="Tahoma" w:hAnsi="Tahoma" w:cs="Tahoma"/>
-                <w:b/>
-                <w:color w:val="000000"/>
-                <w:sz w:val="22"/>
-                <w:szCs w:val="22"/>
-                <w:lang w:val="it-IT"/>
-              </w:rPr>
-              <w:instrText>,</w:instrText>
-            </w:r>
-            <w:r>
-              <w:rPr>
-                <w:rFonts w:ascii="Tahoma" w:hAnsi="Tahoma" w:cs="Tahoma"/>
-                <w:b/>
-                <w:color w:val="000000"/>
-                <w:sz w:val="22"/>
-                <w:szCs w:val="22"/>
-                <w:lang w:val="it-IT"/>
-              </w:rPr>
-              <w:instrText>00</w:instrText>
-            </w:r>
+            </w:pPr>
             <w:r>
               <w:rPr>
                 <w:rFonts w:ascii="Tahoma" w:hAnsi="Tahoma" w:cs="Tahoma"/>
@@ -3786,39 +2743,7 @@
                 <w:szCs w:val="22"/>
                 <w:lang w:val="it-IT"/>
               </w:rPr>
-              <w:instrText xml:space="preserve"> </w:instrText>
-            </w:r>
-            <w:r>
-              <w:rPr>
-                <w:rFonts w:ascii="Tahoma" w:hAnsi="Tahoma" w:cs="Tahoma"/>
-                <w:color w:val="000000"/>
-                <w:sz w:val="22"/>
-                <w:szCs w:val="22"/>
-                <w:lang w:val="it-IT"/>
-              </w:rPr>
-              <w:fldChar w:fldCharType="separate"/>
-            </w:r>
-            <w:r>
-              <w:rPr>
-                <w:rFonts w:ascii="Tahoma" w:hAnsi="Tahoma" w:cs="Tahoma"/>
-                <w:b/>
-                <w:noProof/>
-                <w:color w:val="000000"/>
-                <w:sz w:val="22"/>
-                <w:szCs w:val="22"/>
-                <w:lang w:val="it-IT"/>
-              </w:rPr>
-              <w:t>433,500</w:t>
-            </w:r>
-            <w:r>
-              <w:rPr>
-                <w:rFonts w:ascii="Tahoma" w:hAnsi="Tahoma" w:cs="Tahoma"/>
-                <w:color w:val="000000"/>
-                <w:sz w:val="22"/>
-                <w:szCs w:val="22"/>
-                <w:lang w:val="it-IT"/>
-              </w:rPr>
-              <w:fldChar w:fldCharType="end"/>
+              <w:t>{{ total_bayar }}</w:t>
             </w:r>
           </w:p>
         </w:tc>
@@ -3826,7 +2751,7 @@
       <w:tr>
         <w:tc>
           <w:tcPr>
-            <w:tcW w:w="661" w:type="dxa"/>
+            <w:tcW w:w="555" w:type="dxa"/>
           </w:tcPr>
           <w:p>
             <w:pPr>
@@ -3844,7 +2769,7 @@
         </w:tc>
         <w:tc>
           <w:tcPr>
-            <w:tcW w:w="2235" w:type="dxa"/>
+            <w:tcW w:w="2592" w:type="dxa"/>
           </w:tcPr>
           <w:p>
             <w:pPr>
@@ -3862,7 +2787,7 @@
         </w:tc>
         <w:tc>
           <w:tcPr>
-            <w:tcW w:w="1498" w:type="dxa"/>
+            <w:tcW w:w="1455" w:type="dxa"/>
           </w:tcPr>
           <w:p>
             <w:pPr>
@@ -3880,7 +2805,7 @@
         </w:tc>
         <w:tc>
           <w:tcPr>
-            <w:tcW w:w="1402" w:type="dxa"/>
+            <w:tcW w:w="1261" w:type="dxa"/>
           </w:tcPr>
           <w:p>
             <w:pPr>
@@ -3898,7 +2823,7 @@
         </w:tc>
         <w:tc>
           <w:tcPr>
-            <w:tcW w:w="2235" w:type="dxa"/>
+            <w:tcW w:w="1888" w:type="dxa"/>
           </w:tcPr>
           <w:p>
             <w:pPr>
@@ -3918,7 +2843,7 @@
       <w:tr>
         <w:tc>
           <w:tcPr>
-            <w:tcW w:w="2896" w:type="dxa"/>
+            <w:tcW w:w="3147" w:type="dxa"/>
             <w:gridSpan w:val="2"/>
           </w:tcPr>
           <w:p>
@@ -3949,7 +2874,7 @@
         </w:tc>
         <w:tc>
           <w:tcPr>
-            <w:tcW w:w="1498" w:type="dxa"/>
+            <w:tcW w:w="1455" w:type="dxa"/>
           </w:tcPr>
           <w:p>
             <w:pPr>
@@ -3967,7 +2892,7 @@
         </w:tc>
         <w:tc>
           <w:tcPr>
-            <w:tcW w:w="1402" w:type="dxa"/>
+            <w:tcW w:w="1261" w:type="dxa"/>
           </w:tcPr>
           <w:p>
             <w:pPr>
@@ -3985,7 +2910,7 @@
         </w:tc>
         <w:tc>
           <w:tcPr>
-            <w:tcW w:w="2235" w:type="dxa"/>
+            <w:tcW w:w="1887" w:type="dxa"/>
           </w:tcPr>
           <w:p>
             <w:pPr>
@@ -4021,107 +2946,7 @@
                 <w:szCs w:val="22"/>
                 <w:lang w:val="it-IT"/>
               </w:rPr>
-              <w:fldChar w:fldCharType="begin"/>
-            </w:r>
-            <w:r>
-              <w:rPr>
-                <w:rFonts w:ascii="Tahoma" w:hAnsi="Tahoma" w:cs="Tahoma"/>
-                <w:b/>
-                <w:color w:val="000000"/>
-                <w:sz w:val="22"/>
-                <w:szCs w:val="22"/>
-                <w:lang w:val="it-IT"/>
-              </w:rPr>
-              <w:instrText xml:space="preserve"> </w:instrText>
-            </w:r>
-            <w:r>
-              <w:rPr>
-                <w:rFonts w:ascii="Tahoma" w:hAnsi="Tahoma" w:cs="Tahoma"/>
-                <w:b/>
-                <w:color w:val="000000"/>
-                <w:sz w:val="22"/>
-                <w:szCs w:val="22"/>
-                <w:lang w:val="it-IT"/>
-              </w:rPr>
-              <w:instrText>\</w:instrText>
-            </w:r>
-            <w:r>
-              <w:rPr>
-                <w:rFonts w:ascii="Tahoma" w:hAnsi="Tahoma" w:cs="Tahoma"/>
-                <w:b/>
-                <w:color w:val="000000"/>
-                <w:sz w:val="22"/>
-                <w:szCs w:val="22"/>
-                <w:lang w:val="it-IT"/>
-              </w:rPr>
-              <w:instrText>MERGEFIELD TOTAL_ \#</w:instrText>
-            </w:r>
-            <w:r>
-              <w:rPr>
-                <w:rFonts w:ascii="Tahoma" w:hAnsi="Tahoma" w:cs="Tahoma"/>
-                <w:b/>
-                <w:color w:val="000000"/>
-                <w:sz w:val="22"/>
-                <w:szCs w:val="22"/>
-                <w:lang w:val="it-IT"/>
-              </w:rPr>
-              <w:instrText xml:space="preserve"> 0</w:instrText>
-            </w:r>
-            <w:r>
-              <w:rPr>
-                <w:rFonts w:ascii="Tahoma" w:hAnsi="Tahoma" w:cs="Tahoma"/>
-                <w:b/>
-                <w:color w:val="000000"/>
-                <w:sz w:val="22"/>
-                <w:szCs w:val="22"/>
-                <w:lang w:val="it-IT"/>
-              </w:rPr>
-              <w:instrText>,</w:instrText>
-            </w:r>
-            <w:r>
-              <w:rPr>
-                <w:rFonts w:ascii="Tahoma" w:hAnsi="Tahoma" w:cs="Tahoma"/>
-                <w:b/>
-                <w:color w:val="000000"/>
-                <w:sz w:val="22"/>
-                <w:szCs w:val="22"/>
-                <w:lang w:val="it-IT"/>
-              </w:rPr>
-              <w:instrText>00</w:instrText>
-            </w:r>
-            <w:r>
-              <w:rPr>
-                <w:rFonts w:ascii="Tahoma" w:hAnsi="Tahoma" w:cs="Tahoma"/>
-                <w:b/>
-                <w:color w:val="000000"/>
-                <w:sz w:val="22"/>
-                <w:szCs w:val="22"/>
-                <w:lang w:val="it-IT"/>
-              </w:rPr>
-              <w:fldChar w:fldCharType="separate"/>
-            </w:r>
-            <w:r>
-              <w:rPr>
-                <w:rFonts w:ascii="Tahoma" w:hAnsi="Tahoma" w:cs="Tahoma"/>
-                <w:b/>
-                <w:noProof/>
-                <w:color w:val="000000"/>
-                <w:sz w:val="22"/>
-                <w:szCs w:val="22"/>
-                <w:lang w:val="it-IT"/>
-              </w:rPr>
-              <w:t>433,500</w:t>
-            </w:r>
-            <w:r>
-              <w:rPr>
-                <w:rFonts w:ascii="Tahoma" w:hAnsi="Tahoma" w:cs="Tahoma"/>
-                <w:b/>
-                <w:color w:val="000000"/>
-                <w:sz w:val="22"/>
-                <w:szCs w:val="22"/>
-                <w:lang w:val="it-IT"/>
-              </w:rPr>
-              <w:fldChar w:fldCharType="end"/>
+              <w:t>{{ total_bayar }}</w:t>
             </w:r>
           </w:p>
         </w:tc>
@@ -4398,7 +3223,7 @@
                                 <w:sz w:val="22"/>
                                 <w:szCs w:val="22"/>
                               </w:rPr>
-                              <w:t>KOKO, S.E., M.M.</w:t>
+                              <w:t>{{ nama_kepala_uptd }}</w:t>
                             </w:r>
                           </w:p>
                           <w:p>
@@ -4406,6 +3231,7 @@
                               <w:jc w:val="center"/>
                               <w:rPr>
                                 <w:rFonts w:ascii="Arial" w:hAnsi="Arial" w:cs="Arial"/>
+                                <w:b/>
                                 <w:sz w:val="22"/>
                                 <w:szCs w:val="22"/>
                               </w:rPr>
@@ -4416,7 +3242,7 @@
                                 <w:sz w:val="22"/>
                                 <w:szCs w:val="22"/>
                               </w:rPr>
-                              <w:t>Pembina</w:t>
+                              <w:t>{{ pangkat_kepala_uptd }}</w:t>
                             </w:r>
                           </w:p>
                           <w:p>
@@ -4436,16 +3262,14 @@
                               </w:rPr>
                               <w:t xml:space="preserve">NIP. </w:t>
                             </w:r>
-                            <w:bookmarkStart w:id="0" w:name="_Hlk141443753"/>
                             <w:r>
                               <w:rPr>
                                 <w:rFonts w:ascii="Arial" w:hAnsi="Arial" w:cs="Arial"/>
                                 <w:sz w:val="22"/>
                                 <w:szCs w:val="22"/>
                               </w:rPr>
-                              <w:t>19810323 200801 1 004</w:t>
+                              <w:t>{{ nip_kepala_uptd }}</w:t>
                             </w:r>
-                            <w:bookmarkEnd w:id="0"/>
                           </w:p>
                           <w:p>
                             <w:pPr>
@@ -4616,7 +3440,7 @@
                           <w:sz w:val="22"/>
                           <w:szCs w:val="22"/>
                         </w:rPr>
-                        <w:t>KOKO, S.E., M.M.</w:t>
+                        <w:t>{{ nama_kepala_uptd }}</w:t>
                       </w:r>
                     </w:p>
                     <w:p>
@@ -4624,6 +3448,7 @@
                         <w:jc w:val="center"/>
                         <w:rPr>
                           <w:rFonts w:ascii="Arial" w:hAnsi="Arial" w:cs="Arial"/>
+                          <w:b/>
                           <w:sz w:val="22"/>
                           <w:szCs w:val="22"/>
                         </w:rPr>
@@ -4634,7 +3459,7 @@
                           <w:sz w:val="22"/>
                           <w:szCs w:val="22"/>
                         </w:rPr>
-                        <w:t>Pembina</w:t>
+                        <w:t>{{ pangkat_kepala_uptd }}</w:t>
                       </w:r>
                     </w:p>
                     <w:p>
@@ -4654,16 +3479,14 @@
                         </w:rPr>
                         <w:t xml:space="preserve">NIP. </w:t>
                       </w:r>
-                      <w:bookmarkStart w:id="1" w:name="_Hlk141443753"/>
                       <w:r>
                         <w:rPr>
                           <w:rFonts w:ascii="Arial" w:hAnsi="Arial" w:cs="Arial"/>
                           <w:sz w:val="22"/>
                           <w:szCs w:val="22"/>
                         </w:rPr>
-                        <w:t>19810323 200801 1 004</w:t>
+                        <w:t>{{ nip_kepala_uptd }}</w:t>
                       </w:r>
-                      <w:bookmarkEnd w:id="1"/>
                     </w:p>
                     <w:p>
                       <w:pPr>
@@ -4792,19 +3615,12 @@
           <w:lang w:val="en-US"/>
         </w:rPr>
       </w:pPr>
-      <w:proofErr w:type="gramStart"/>
       <w:r>
         <w:rPr>
           <w:lang w:val="en-US"/>
         </w:rPr>
-        <w:t>NB :</w:t>
-      </w:r>
-      <w:proofErr w:type="gramEnd"/>
-      <w:r>
-        <w:rPr>
-          <w:lang w:val="en-US"/>
-        </w:rPr>
-        <w:t xml:space="preserve"> </w:t>
+        <w:lastRenderedPageBreak/>
+        <w:t xml:space="preserve">NB : </w:t>
       </w:r>
       <w:r>
         <w:rPr>
@@ -7455,6 +6271,50 @@
     <w:lsdException w:name="Subtitle" w:qFormat="1"/>
     <w:lsdException w:name="Strong" w:qFormat="1"/>
     <w:lsdException w:name="Emphasis" w:qFormat="1"/>
+    <w:lsdException w:name="Normal Table" w:semiHidden="1" w:unhideWhenUsed="1"/>
+    <w:lsdException w:name="Table Simple 1" w:semiHidden="1" w:unhideWhenUsed="1"/>
+    <w:lsdException w:name="Table Simple 2" w:semiHidden="1" w:unhideWhenUsed="1"/>
+    <w:lsdException w:name="Table Simple 3" w:semiHidden="1" w:unhideWhenUsed="1"/>
+    <w:lsdException w:name="Table Classic 1" w:semiHidden="1" w:unhideWhenUsed="1"/>
+    <w:lsdException w:name="Table Classic 2" w:semiHidden="1" w:unhideWhenUsed="1"/>
+    <w:lsdException w:name="Table Classic 3" w:semiHidden="1" w:unhideWhenUsed="1"/>
+    <w:lsdException w:name="Table Classic 4" w:semiHidden="1" w:unhideWhenUsed="1"/>
+    <w:lsdException w:name="Table Colorful 1" w:semiHidden="1" w:unhideWhenUsed="1"/>
+    <w:lsdException w:name="Table Colorful 2" w:semiHidden="1" w:unhideWhenUsed="1"/>
+    <w:lsdException w:name="Table Colorful 3" w:semiHidden="1" w:unhideWhenUsed="1"/>
+    <w:lsdException w:name="Table Columns 1" w:semiHidden="1" w:unhideWhenUsed="1"/>
+    <w:lsdException w:name="Table Columns 2" w:semiHidden="1" w:unhideWhenUsed="1"/>
+    <w:lsdException w:name="Table Columns 3" w:semiHidden="1" w:unhideWhenUsed="1"/>
+    <w:lsdException w:name="Table Columns 4" w:semiHidden="1" w:unhideWhenUsed="1"/>
+    <w:lsdException w:name="Table Columns 5" w:semiHidden="1" w:unhideWhenUsed="1"/>
+    <w:lsdException w:name="Table Grid 1" w:semiHidden="1" w:unhideWhenUsed="1"/>
+    <w:lsdException w:name="Table Grid 2" w:semiHidden="1" w:unhideWhenUsed="1"/>
+    <w:lsdException w:name="Table Grid 3" w:semiHidden="1" w:unhideWhenUsed="1"/>
+    <w:lsdException w:name="Table Grid 4" w:semiHidden="1" w:unhideWhenUsed="1"/>
+    <w:lsdException w:name="Table Grid 5" w:semiHidden="1" w:unhideWhenUsed="1"/>
+    <w:lsdException w:name="Table Grid 6" w:semiHidden="1" w:unhideWhenUsed="1"/>
+    <w:lsdException w:name="Table Grid 7" w:semiHidden="1" w:unhideWhenUsed="1"/>
+    <w:lsdException w:name="Table Grid 8" w:semiHidden="1" w:unhideWhenUsed="1"/>
+    <w:lsdException w:name="Table List 1" w:semiHidden="1" w:unhideWhenUsed="1"/>
+    <w:lsdException w:name="Table List 2" w:semiHidden="1" w:unhideWhenUsed="1"/>
+    <w:lsdException w:name="Table List 3" w:semiHidden="1" w:unhideWhenUsed="1"/>
+    <w:lsdException w:name="Table List 4" w:semiHidden="1" w:unhideWhenUsed="1"/>
+    <w:lsdException w:name="Table List 5" w:semiHidden="1" w:unhideWhenUsed="1"/>
+    <w:lsdException w:name="Table List 6" w:semiHidden="1" w:unhideWhenUsed="1"/>
+    <w:lsdException w:name="Table List 7" w:semiHidden="1" w:unhideWhenUsed="1"/>
+    <w:lsdException w:name="Table List 8" w:semiHidden="1" w:unhideWhenUsed="1"/>
+    <w:lsdException w:name="Table 3D effects 1" w:semiHidden="1" w:unhideWhenUsed="1"/>
+    <w:lsdException w:name="Table 3D effects 2" w:semiHidden="1" w:unhideWhenUsed="1"/>
+    <w:lsdException w:name="Table 3D effects 3" w:semiHidden="1" w:unhideWhenUsed="1"/>
+    <w:lsdException w:name="Table Contemporary" w:semiHidden="1" w:unhideWhenUsed="1"/>
+    <w:lsdException w:name="Table Elegant" w:semiHidden="1" w:unhideWhenUsed="1"/>
+    <w:lsdException w:name="Table Professional" w:semiHidden="1" w:unhideWhenUsed="1"/>
+    <w:lsdException w:name="Table Subtle 1" w:semiHidden="1" w:unhideWhenUsed="1"/>
+    <w:lsdException w:name="Table Subtle 2" w:semiHidden="1" w:unhideWhenUsed="1"/>
+    <w:lsdException w:name="Table Web 1" w:semiHidden="1" w:unhideWhenUsed="1"/>
+    <w:lsdException w:name="Table Web 2" w:semiHidden="1" w:unhideWhenUsed="1"/>
+    <w:lsdException w:name="Table Web 3" w:semiHidden="1" w:unhideWhenUsed="1"/>
+    <w:lsdException w:name="Table Theme" w:semiHidden="1" w:unhideWhenUsed="1"/>
     <w:lsdException w:name="Placeholder Text" w:semiHidden="1" w:uiPriority="99"/>
     <w:lsdException w:name="No Spacing" w:uiPriority="1" w:qFormat="1"/>
     <w:lsdException w:name="Light Shading" w:uiPriority="60"/>
@@ -7736,11 +6596,15 @@
   </w:style>
   <w:style w:type="character" w:default="1" w:styleId="DefaultParagraphFont">
     <w:name w:val="Default Paragraph Font"/>
+    <w:uiPriority w:val="1"/>
     <w:semiHidden/>
+    <w:unhideWhenUsed/>
   </w:style>
   <w:style w:type="table" w:default="1" w:styleId="TableNormal">
     <w:name w:val="Normal Table"/>
+    <w:uiPriority w:val="99"/>
     <w:semiHidden/>
+    <w:unhideWhenUsed/>
     <w:tblPr>
       <w:tblInd w:w="0" w:type="dxa"/>
       <w:tblCellMar>
@@ -7753,7 +6617,9 @@
   </w:style>
   <w:style w:type="numbering" w:default="1" w:styleId="NoList">
     <w:name w:val="No List"/>
+    <w:uiPriority w:val="99"/>
     <w:semiHidden/>
+    <w:unhideWhenUsed/>
   </w:style>
   <w:style w:type="paragraph" w:styleId="BodyTextIndent">
     <w:name w:val="Body Text Indent"/>

</xml_diff>